<commit_message>
Corregir fecha: 11 de septiembre es viernes (no jueves) en placas, copys, plan y convocatoria
Co-Authored-By: Claude Opus 4.8 <noreply@anthropic.com>
Claude-Session: https://claude.ai/code/session_01UVmXQvJvFHVm5DJrwuBNEc
</commit_message>
<xml_diff>
--- a/docs/impro/IMPRO-Convocatoria-Alternativa-Teatral.docx
+++ b/docs/impro/IMPRO-Convocatoria-Alternativa-Teatral.docx
@@ -26,7 +26,7 @@
         </w:rPr>
         <w:t>Serie web interactiva que se filma en bares reales · Zona Oeste</w:t>
         <w:br/>
-        <w:t>Producida por 21:15 Films · Estreno: jueves 11 de septiembre, 21:15</w:t>
+        <w:t>Producida por 21:15 Films · Estreno: viernes 11 de septiembre, 21:15</w:t>
       </w:r>
     </w:p>
     <w:p/>
@@ -359,7 +359,7 @@
         <w:pStyle w:val="ListBullet"/>
       </w:pPr>
       <w:r>
-        <w:t>Estreno: jueves 11 de septiembre de 2026, 21:15</w:t>
+        <w:t>Estreno: viernes 11 de septiembre de 2026, 21:15</w:t>
       </w:r>
     </w:p>
     <w:p>

</xml_diff>